<commit_message>
Liquidacion + gastos terminado
</commit_message>
<xml_diff>
--- a/public/templates/liquidacion-base2.docx
+++ b/public/templates/liquidacion-base2.docx
@@ -260,10 +260,7 @@
         </w:tc>
       </w:tr>
     </w:tbl>
-    <w:p>
-      <w:bookmarkStart w:id="0" w:name="_GoBack"/>
-      <w:bookmarkEnd w:id="0"/>
-    </w:p>
+    <w:p/>
     <w:p/>
     <w:tbl>
       <w:tblPr>
@@ -346,6 +343,90 @@
         </w:tc>
       </w:tr>
       <w:tr>
+        <w:tc>
+          <w:tcPr>
+            <w:tcW w:w="1000" w:type="pct"/>
+          </w:tcPr>
+          <w:p>
+            <w:pPr>
+              <w:rPr>
+                <w:b/>
+                <w:sz w:val="22"/>
+              </w:rPr>
+            </w:pPr>
+          </w:p>
+        </w:tc>
+        <w:tc>
+          <w:tcPr>
+            <w:tcW w:w="2000" w:type="pct"/>
+          </w:tcPr>
+          <w:p>
+            <w:pPr>
+              <w:rPr>
+                <w:b/>
+                <w:sz w:val="22"/>
+              </w:rPr>
+            </w:pPr>
+            <w:bookmarkStart w:id="0" w:name="_GoBack"/>
+            <w:bookmarkEnd w:id="0"/>
+            <w:r>
+              <w:rPr>
+                <w:b/>
+                <w:sz w:val="22"/>
+              </w:rPr>
+              <w:t>Alquiler</w:t>
+            </w:r>
+          </w:p>
+        </w:tc>
+        <w:tc>
+          <w:tcPr>
+            <w:tcW w:w="1000" w:type="pct"/>
+          </w:tcPr>
+          <w:p>
+            <w:pPr>
+              <w:jc w:val="right"/>
+              <w:rPr>
+                <w:b/>
+                <w:sz w:val="22"/>
+              </w:rPr>
+            </w:pPr>
+            <w:r>
+              <w:rPr>
+                <w:b/>
+                <w:sz w:val="22"/>
+              </w:rPr>
+              <w:t>${</w:t>
+            </w:r>
+            <w:proofErr w:type="spellStart"/>
+            <w:r>
+              <w:rPr>
+                <w:b/>
+                <w:sz w:val="22"/>
+              </w:rPr>
+              <w:t>montoAlquiler</w:t>
+            </w:r>
+            <w:proofErr w:type="spellEnd"/>
+            <w:r>
+              <w:rPr>
+                <w:b/>
+                <w:sz w:val="22"/>
+              </w:rPr>
+              <w:t>}</w:t>
+            </w:r>
+          </w:p>
+        </w:tc>
+        <w:tc>
+          <w:tcPr>
+            <w:tcW w:w="1000" w:type="pct"/>
+          </w:tcPr>
+          <w:p>
+            <w:pPr>
+              <w:jc w:val="right"/>
+            </w:pPr>
+          </w:p>
+        </w:tc>
+      </w:tr>
+      <w:tr>
         <w:trPr>
           <w:cnfStyle w:val="010000000000" w:firstRow="0" w:lastRow="1" w:firstColumn="0" w:lastColumn="0" w:oddVBand="0" w:evenVBand="0" w:oddHBand="0" w:evenHBand="0" w:firstRowFirstColumn="0" w:firstRowLastColumn="0" w:lastRowFirstColumn="0" w:lastRowLastColumn="0"/>
         </w:trPr>
@@ -378,39 +459,7 @@
                 <w:b/>
                 <w:sz w:val="22"/>
               </w:rPr>
-              <w:t>{#</w:t>
-            </w:r>
-            <w:proofErr w:type="spellStart"/>
-            <w:r>
-              <w:rPr>
-                <w:b/>
-                <w:sz w:val="22"/>
-              </w:rPr>
-              <w:t>items</w:t>
-            </w:r>
-            <w:proofErr w:type="spellEnd"/>
-            <w:r>
-              <w:rPr>
-                <w:b/>
-                <w:sz w:val="22"/>
-              </w:rPr>
-              <w:t>}{</w:t>
-            </w:r>
-            <w:proofErr w:type="spellStart"/>
-            <w:r>
-              <w:rPr>
-                <w:b/>
-                <w:sz w:val="22"/>
-              </w:rPr>
-              <w:t>descripcion</w:t>
-            </w:r>
-            <w:proofErr w:type="spellEnd"/>
-            <w:r>
-              <w:rPr>
-                <w:b/>
-                <w:sz w:val="22"/>
-              </w:rPr>
-              <w:t>}</w:t>
+              <w:t>{#items}{descripcion}</w:t>
             </w:r>
           </w:p>
         </w:tc>
@@ -1565,14 +1614,14 @@
     <w:charset w:val="00"/>
     <w:family w:val="roman"/>
     <w:pitch w:val="variable"/>
-    <w:sig w:usb0="E0002EFF" w:usb1="C000785B" w:usb2="00000009" w:usb3="00000000" w:csb0="000001FF" w:csb1="00000000"/>
+    <w:sig w:usb0="E0002AFF" w:usb1="C0007843" w:usb2="00000009" w:usb3="00000000" w:csb0="000001FF" w:csb1="00000000"/>
   </w:font>
   <w:font w:name="Calibri">
     <w:panose1 w:val="020F0502020204030204"/>
     <w:charset w:val="00"/>
     <w:family w:val="swiss"/>
     <w:pitch w:val="variable"/>
-    <w:sig w:usb0="E4002EFF" w:usb1="C200247B" w:usb2="00000009" w:usb3="00000000" w:csb0="000001FF" w:csb1="00000000"/>
+    <w:sig w:usb0="E00002FF" w:usb1="4000ACFF" w:usb2="00000001" w:usb3="00000000" w:csb0="0000019F" w:csb1="00000000"/>
   </w:font>
   <w:font w:name="Cordia New">
     <w:altName w:val="Microsoft Sans Serif"/>
@@ -1594,7 +1643,7 @@
     <w:charset w:val="00"/>
     <w:family w:val="swiss"/>
     <w:pitch w:val="variable"/>
-    <w:sig w:usb0="E4002EFF" w:usb1="C200247B" w:usb2="00000009" w:usb3="00000000" w:csb0="000001FF" w:csb1="00000000"/>
+    <w:sig w:usb0="A00002EF" w:usb1="4000207B" w:usb2="00000000" w:usb3="00000000" w:csb0="0000009F" w:csb1="00000000"/>
   </w:font>
 </w:fonts>
 </file>
@@ -1617,6 +1666,7 @@
     <w:rsid w:val="000A661B"/>
     <w:rsid w:val="001B3A63"/>
     <w:rsid w:val="00304FD7"/>
+    <w:rsid w:val="00CD69AA"/>
     <w:rsid w:val="00D01AF8"/>
     <w:rsid w:val="00FD4F54"/>
   </w:rsids>
@@ -2396,12 +2446,6 @@
 </file>
 
 <file path=customXml/item1.xml><?xml version="1.0" encoding="utf-8"?>
-<mappings xmlns="http://schemas.microsoft.com/pics">
-  <picture>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</picture>
-</mappings>
-</file>
-
-<file path=customXml/item2.xml><?xml version="1.0" encoding="utf-8"?>
 <?mso-contentType ?>
 <FormTemplates xmlns="http://schemas.microsoft.com/sharepoint/v3/contenttype/forms">
   <Display>DocumentLibraryForm</Display>
@@ -2410,11 +2454,25 @@
 </FormTemplates>
 </file>
 
+<file path=customXml/item2.xml><?xml version="1.0" encoding="utf-8"?>
+<mappings xmlns="http://schemas.microsoft.com/pics">
+  <picture>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</picture>
+</mappings>
+</file>
+
 <file path=customXml/item3.xml><?xml version="1.0" encoding="utf-8"?>
 <b:Sources xmlns:b="http://schemas.openxmlformats.org/officeDocument/2006/bibliography" xmlns="http://schemas.openxmlformats.org/officeDocument/2006/bibliography" SelectedStyle="\APA.XSL" StyleName="APA"/>
 </file>
 
 <file path=customXml/itemProps1.xml><?xml version="1.0" encoding="utf-8"?>
+<ds:datastoreItem xmlns:ds="http://schemas.openxmlformats.org/officeDocument/2006/customXml" ds:itemID="{2B5AC0F6-37D9-4798-8475-2E772377793B}">
+  <ds:schemaRefs>
+    <ds:schemaRef ds:uri="http://schemas.microsoft.com/sharepoint/v3/contenttype/forms"/>
+  </ds:schemaRefs>
+</ds:datastoreItem>
+</file>
+
+<file path=customXml/itemProps2.xml><?xml version="1.0" encoding="utf-8"?>
 <ds:datastoreItem xmlns:ds="http://schemas.openxmlformats.org/officeDocument/2006/customXml" ds:itemID="{47E18979-C756-43FD-9D2A-15203E6A502A}">
   <ds:schemaRefs>
     <ds:schemaRef ds:uri="http://schemas.microsoft.com/pics"/>
@@ -2422,16 +2480,8 @@
 </ds:datastoreItem>
 </file>
 
-<file path=customXml/itemProps2.xml><?xml version="1.0" encoding="utf-8"?>
-<ds:datastoreItem xmlns:ds="http://schemas.openxmlformats.org/officeDocument/2006/customXml" ds:itemID="{2B5AC0F6-37D9-4798-8475-2E772377793B}">
-  <ds:schemaRefs>
-    <ds:schemaRef ds:uri="http://schemas.microsoft.com/sharepoint/v3/contenttype/forms"/>
-  </ds:schemaRefs>
-</ds:datastoreItem>
-</file>
-
 <file path=customXml/itemProps3.xml><?xml version="1.0" encoding="utf-8"?>
-<ds:datastoreItem xmlns:ds="http://schemas.openxmlformats.org/officeDocument/2006/customXml" ds:itemID="{CE66FC4E-D4FF-4FA5-9288-C0C37D77BCE1}">
+<ds:datastoreItem xmlns:ds="http://schemas.openxmlformats.org/officeDocument/2006/customXml" ds:itemID="{73F0E0BE-CBF5-4EAD-8AAE-F06DB541DD99}">
   <ds:schemaRefs>
     <ds:schemaRef ds:uri="http://schemas.openxmlformats.org/officeDocument/2006/bibliography"/>
   </ds:schemaRefs>

</xml_diff>